<commit_message>
week 4 gate 4  _4
</commit_message>
<xml_diff>
--- a/Demo_Report.docx
+++ b/Demo_Report.docx
@@ -554,7 +554,14 @@
           <w:b/>
           <w:bCs/>
         </w:rPr>
-        <w:t>4. Project structure</w:t>
+        <w:t>3</w:t>
+      </w:r>
+      <w:r>
+        <w:rPr>
+          <w:b/>
+          <w:bCs/>
+        </w:rPr>
+        <w:t>. Project structure</w:t>
       </w:r>
     </w:p>
     <w:p>
@@ -619,95 +626,567 @@
           <w:b/>
           <w:bCs/>
         </w:rPr>
-        <w:t>5. Test cases covered (3)</w:t>
-      </w:r>
-    </w:p>
-    <w:p>
+        <w:t>SELENIDE</w:t>
+      </w:r>
+    </w:p>
+    <w:p>
+      <w:pPr>
+        <w:rPr>
+          <w:b/>
+          <w:bCs/>
+        </w:rPr>
+      </w:pPr>
+      <w:r>
+        <w:rPr>
+          <w:b/>
+          <w:bCs/>
+        </w:rPr>
+        <w:lastRenderedPageBreak/>
+        <w:drawing>
+          <wp:inline distT="0" distB="0" distL="0" distR="0" wp14:anchorId="5C07B4AF" wp14:editId="048662C7">
+            <wp:extent cx="5731510" cy="4977130"/>
+            <wp:effectExtent l="0" t="0" r="2540" b="0"/>
+            <wp:docPr id="1717257258" name="Picture 1"/>
+            <wp:cNvGraphicFramePr>
+              <a:graphicFrameLocks xmlns:a="http://schemas.openxmlformats.org/drawingml/2006/main" noChangeAspect="1"/>
+            </wp:cNvGraphicFramePr>
+            <a:graphic xmlns:a="http://schemas.openxmlformats.org/drawingml/2006/main">
+              <a:graphicData uri="http://schemas.openxmlformats.org/drawingml/2006/picture">
+                <pic:pic xmlns:pic="http://schemas.openxmlformats.org/drawingml/2006/picture">
+                  <pic:nvPicPr>
+                    <pic:cNvPr id="1717257258" name=""/>
+                    <pic:cNvPicPr/>
+                  </pic:nvPicPr>
+                  <pic:blipFill>
+                    <a:blip r:embed="rId6"/>
+                    <a:stretch>
+                      <a:fillRect/>
+                    </a:stretch>
+                  </pic:blipFill>
+                  <pic:spPr>
+                    <a:xfrm>
+                      <a:off x="0" y="0"/>
+                      <a:ext cx="5731510" cy="4977130"/>
+                    </a:xfrm>
+                    <a:prstGeom prst="rect">
+                      <a:avLst/>
+                    </a:prstGeom>
+                  </pic:spPr>
+                </pic:pic>
+              </a:graphicData>
+            </a:graphic>
+          </wp:inline>
+        </w:drawing>
+      </w:r>
+    </w:p>
+    <w:p>
+      <w:pPr>
+        <w:rPr>
+          <w:b/>
+          <w:bCs/>
+        </w:rPr>
+      </w:pPr>
+      <w:r>
+        <w:rPr>
+          <w:b/>
+          <w:bCs/>
+        </w:rPr>
+        <w:t>4</w:t>
+      </w:r>
+      <w:r>
+        <w:rPr>
+          <w:b/>
+          <w:bCs/>
+        </w:rPr>
+        <w:t xml:space="preserve">. Test cases covered </w:t>
+      </w:r>
+    </w:p>
+    <w:p>
+      <w:pPr>
+        <w:rPr>
+          <w:b/>
+          <w:bCs/>
+        </w:rPr>
+      </w:pPr>
       <w:r>
         <w:t> </w:t>
       </w:r>
-    </w:p>
-    <w:p>
-      <w:r>
-        <w:t> </w:t>
-      </w:r>
-    </w:p>
-    <w:p>
-      <w:r>
-        <w:t> </w:t>
-      </w:r>
-    </w:p>
-    <w:p>
-      <w:pPr>
-        <w:rPr>
-          <w:b/>
-          <w:bCs/>
-        </w:rPr>
-      </w:pPr>
-      <w:r>
-        <w:rPr>
-          <w:b/>
-          <w:bCs/>
-        </w:rPr>
-        <w:t>7. Results</w:t>
-      </w:r>
-    </w:p>
-    <w:p>
-      <w:r>
-        <w:t> </w:t>
-      </w:r>
-    </w:p>
-    <w:p>
-      <w:r>
-        <w:t>There are 3 Testcase:</w:t>
+      <w:r>
+        <w:rPr>
+          <w:b/>
+          <w:bCs/>
+        </w:rPr>
+        <w:t>File Name: ProductAvailabilityBadgeTest.java</w:t>
+      </w:r>
+    </w:p>
+    <w:p>
+      <w:pPr>
+        <w:rPr>
+          <w:b/>
+          <w:bCs/>
+        </w:rPr>
+      </w:pPr>
+      <w:r>
+        <w:rPr>
+          <w:b/>
+          <w:bCs/>
+        </w:rPr>
+        <w:t>Purpose</w:t>
+      </w:r>
+    </w:p>
+    <w:p>
+      <w:r>
+        <w:t>This test verifies that a product displays the correct availability information after a user logs in, searches for a product, and opens its details page.</w:t>
+      </w:r>
+    </w:p>
+    <w:p>
+      <w:pPr>
+        <w:rPr>
+          <w:b/>
+          <w:bCs/>
+        </w:rPr>
+      </w:pPr>
+      <w:r>
+        <w:rPr>
+          <w:b/>
+          <w:bCs/>
+        </w:rPr>
+        <w:t>Key Points</w:t>
       </w:r>
     </w:p>
     <w:p>
       <w:pPr>
         <w:numPr>
           <w:ilvl w:val="0"/>
-          <w:numId w:val="5"/>
+          <w:numId w:val="7"/>
         </w:numPr>
       </w:pPr>
       <w:r>
-        <w:t>Full Happy path contains all HTTP Methods including -POST,GET,PUT and DELETE</w:t>
+        <w:rPr>
+          <w:b/>
+          <w:bCs/>
+        </w:rPr>
+        <w:t>Configure Test Environment</w:t>
+      </w:r>
+    </w:p>
+    <w:p>
+      <w:pPr>
+        <w:numPr>
+          <w:ilvl w:val="1"/>
+          <w:numId w:val="7"/>
+        </w:numPr>
+      </w:pPr>
+      <w:r>
+        <w:t>The @BeforeAll method calls SelenideConfig.configure() to initialize the browser and load the required test configuration before executing the test.</w:t>
       </w:r>
     </w:p>
     <w:p>
       <w:pPr>
         <w:numPr>
           <w:ilvl w:val="0"/>
-          <w:numId w:val="5"/>
+          <w:numId w:val="7"/>
         </w:numPr>
       </w:pPr>
       <w:r>
-        <w:t>GET methods with id and without id</w:t>
+        <w:rPr>
+          <w:b/>
+          <w:bCs/>
+        </w:rPr>
+        <w:t>Login and Navigate to Catalog</w:t>
+      </w:r>
+    </w:p>
+    <w:p>
+      <w:pPr>
+        <w:numPr>
+          <w:ilvl w:val="1"/>
+          <w:numId w:val="7"/>
+        </w:numPr>
+      </w:pPr>
+      <w:r>
+        <w:lastRenderedPageBreak/>
+        <w:t>The test opens the login page, authenticates using the email and password from the .env file through TestEnvironment.required(), and then navigates to the product catalog.</w:t>
       </w:r>
     </w:p>
     <w:p>
       <w:pPr>
         <w:numPr>
           <w:ilvl w:val="0"/>
-          <w:numId w:val="5"/>
+          <w:numId w:val="7"/>
         </w:numPr>
       </w:pPr>
       <w:r>
-        <w:t>GET with Param</w:t>
-      </w:r>
-    </w:p>
-    <w:p>
-      <w:r>
+        <w:rPr>
+          <w:b/>
+          <w:bCs/>
+        </w:rPr>
+        <w:t>Search and Open Product</w:t>
+      </w:r>
+    </w:p>
+    <w:p>
+      <w:pPr>
+        <w:numPr>
+          <w:ilvl w:val="1"/>
+          <w:numId w:val="7"/>
+        </w:numPr>
+      </w:pPr>
+      <w:r>
+        <w:t xml:space="preserve">It searches for the product </w:t>
+      </w:r>
+      <w:r>
+        <w:rPr>
+          <w:b/>
+          <w:bCs/>
+        </w:rPr>
+        <w:t>"Laptop"</w:t>
+      </w:r>
+      <w:r>
+        <w:t xml:space="preserve"> and opens the first product from the search results using the openFirstProduct() method.</w:t>
+      </w:r>
+    </w:p>
+    <w:p>
+      <w:pPr>
+        <w:numPr>
+          <w:ilvl w:val="0"/>
+          <w:numId w:val="7"/>
+        </w:numPr>
+      </w:pPr>
+      <w:r>
+        <w:rPr>
+          <w:b/>
+          <w:bCs/>
+        </w:rPr>
+        <w:t>Validate Product Information</w:t>
+      </w:r>
+    </w:p>
+    <w:p>
+      <w:pPr>
+        <w:numPr>
+          <w:ilvl w:val="1"/>
+          <w:numId w:val="7"/>
+        </w:numPr>
+      </w:pPr>
+      <w:r>
+        <w:t>The test verifies that the product name is not empty, confirms that the availability badge is displayed, and checks that the product price is greater than zero.</w:t>
+      </w:r>
+    </w:p>
+    <w:p>
+      <w:pPr>
+        <w:numPr>
+          <w:ilvl w:val="0"/>
+          <w:numId w:val="7"/>
+        </w:numPr>
+      </w:pPr>
+      <w:r>
+        <w:rPr>
+          <w:b/>
+          <w:bCs/>
+        </w:rPr>
+        <w:t>Verify Availability Badge</w:t>
+      </w:r>
+    </w:p>
+    <w:p>
+      <w:pPr>
+        <w:numPr>
+          <w:ilvl w:val="1"/>
+          <w:numId w:val="7"/>
+        </w:numPr>
+      </w:pPr>
+      <w:r>
+        <w:t xml:space="preserve">Finally, the test validates that the availability badge text is exactly </w:t>
+      </w:r>
+      <w:r>
+        <w:rPr>
+          <w:b/>
+          <w:bCs/>
+        </w:rPr>
+        <w:t>"In stock"</w:t>
+      </w:r>
+      <w:r>
+        <w:t>, ensuring that the correct stock status is displayed to the user.</w:t>
+      </w:r>
+    </w:p>
+    <w:p>
+      <w:pPr>
+        <w:ind w:left="720"/>
+      </w:pPr>
+    </w:p>
+    <w:p>
+      <w:pPr>
+        <w:rPr>
+          <w:b/>
+          <w:bCs/>
+        </w:rPr>
+      </w:pPr>
+      <w:r>
+        <w:rPr>
+          <w:b/>
+          <w:bCs/>
+        </w:rPr>
+        <w:t>File Name: PosOmsConsumerPactTest.java</w:t>
+      </w:r>
+    </w:p>
+    <w:p>
+      <w:pPr>
+        <w:rPr>
+          <w:b/>
+          <w:bCs/>
+        </w:rPr>
+      </w:pPr>
+      <w:r>
+        <w:rPr>
+          <w:b/>
+          <w:bCs/>
+        </w:rPr>
+        <w:t>Purpose</w:t>
+      </w:r>
+    </w:p>
+    <w:p>
+      <w:r>
+        <w:t>This class contains Pact Consumer Contract Tests for the POS (Point of Sale) system. It verifies that the POS consumer and OMS provider agree on the request and response contracts for different REST API operations using a Pact Mock Server.</w:t>
+      </w:r>
+    </w:p>
+    <w:p>
+      <w:pPr>
+        <w:rPr>
+          <w:b/>
+          <w:bCs/>
+        </w:rPr>
+      </w:pPr>
+      <w:r>
+        <w:rPr>
+          <w:b/>
+          <w:bCs/>
+        </w:rPr>
+        <w:t>Key Points</w:t>
+      </w:r>
+    </w:p>
+    <w:p>
+      <w:pPr>
+        <w:numPr>
+          <w:ilvl w:val="0"/>
+          <w:numId w:val="8"/>
+        </w:numPr>
+      </w:pPr>
+      <w:r>
+        <w:rPr>
+          <w:b/>
+          <w:bCs/>
+        </w:rPr>
+        <w:t>Consumer Contract Definition</w:t>
+      </w:r>
+    </w:p>
+    <w:p>
+      <w:pPr>
+        <w:numPr>
+          <w:ilvl w:val="1"/>
+          <w:numId w:val="8"/>
+        </w:numPr>
+      </w:pPr>
+      <w:r>
+        <w:t xml:space="preserve">The class uses the @Pact annotation to define consumer contracts for different API operations such as </w:t>
+      </w:r>
+      <w:r>
+        <w:rPr>
+          <w:b/>
+          <w:bCs/>
+        </w:rPr>
+        <w:t>GET, POST, PUT, PATCH, and DELETE</w:t>
+      </w:r>
+      <w:r>
+        <w:t>.</w:t>
+      </w:r>
+    </w:p>
+    <w:p>
+      <w:pPr>
+        <w:numPr>
+          <w:ilvl w:val="1"/>
+          <w:numId w:val="8"/>
+        </w:numPr>
+      </w:pPr>
+      <w:r>
+        <w:t>Each contract specifies the expected request, response status, headers, and JSON body using PactDslJsonBody.</w:t>
+      </w:r>
+    </w:p>
+    <w:p>
+      <w:pPr>
+        <w:numPr>
+          <w:ilvl w:val="0"/>
+          <w:numId w:val="8"/>
+        </w:numPr>
+      </w:pPr>
+      <w:r>
+        <w:rPr>
+          <w:b/>
+          <w:bCs/>
+        </w:rPr>
+        <w:t>Mock Server Verification</w:t>
+      </w:r>
+    </w:p>
+    <w:p>
+      <w:pPr>
+        <w:numPr>
+          <w:ilvl w:val="1"/>
+          <w:numId w:val="8"/>
+        </w:numPr>
+      </w:pPr>
+      <w:r>
+        <w:t>Each test method uses @PactTestFor to start a Pact Mock Server.</w:t>
+      </w:r>
+    </w:p>
+    <w:p>
+      <w:pPr>
+        <w:numPr>
+          <w:ilvl w:val="1"/>
+          <w:numId w:val="8"/>
+        </w:numPr>
+      </w:pPr>
+      <w:r>
+        <w:t>The POS consumer sends requests to the mock server instead of the real OMS service, ensuring the consumer implementation follows the agreed contract.</w:t>
+      </w:r>
+    </w:p>
+    <w:p>
+      <w:pPr>
+        <w:numPr>
+          <w:ilvl w:val="0"/>
+          <w:numId w:val="8"/>
+        </w:numPr>
+      </w:pPr>
+      <w:r>
+        <w:rPr>
+          <w:b/>
+          <w:bCs/>
+        </w:rPr>
+        <w:t>CRUD Operation Coverage</w:t>
+      </w:r>
+    </w:p>
+    <w:p>
+      <w:pPr>
+        <w:numPr>
+          <w:ilvl w:val="1"/>
+          <w:numId w:val="8"/>
+        </w:numPr>
+      </w:pPr>
+      <w:r>
+        <w:t>The test suite validates all major REST operations:</w:t>
+      </w:r>
+    </w:p>
+    <w:p>
+      <w:pPr>
+        <w:numPr>
+          <w:ilvl w:val="2"/>
+          <w:numId w:val="8"/>
+        </w:numPr>
+      </w:pPr>
+      <w:r>
+        <w:rPr>
+          <w:b/>
+          <w:bCs/>
+        </w:rPr>
         <w:lastRenderedPageBreak/>
+        <w:t>GET</w:t>
+      </w:r>
+      <w:r>
+        <w:t xml:space="preserve"> – Retrieve an existing order.</w:t>
+      </w:r>
+    </w:p>
+    <w:p>
+      <w:pPr>
+        <w:numPr>
+          <w:ilvl w:val="2"/>
+          <w:numId w:val="8"/>
+        </w:numPr>
+      </w:pPr>
+      <w:r>
+        <w:rPr>
+          <w:b/>
+          <w:bCs/>
+        </w:rPr>
+        <w:t>GET (Negative)</w:t>
+      </w:r>
+      <w:r>
+        <w:t xml:space="preserve"> – Verify "Order Not Found" (404).</w:t>
+      </w:r>
+    </w:p>
+    <w:p>
+      <w:pPr>
+        <w:numPr>
+          <w:ilvl w:val="2"/>
+          <w:numId w:val="8"/>
+        </w:numPr>
+      </w:pPr>
+      <w:r>
+        <w:rPr>
+          <w:b/>
+          <w:bCs/>
+        </w:rPr>
+        <w:t>POST</w:t>
+      </w:r>
+      <w:r>
+        <w:t xml:space="preserve"> – Create a new order.</w:t>
+      </w:r>
+    </w:p>
+    <w:p>
+      <w:pPr>
+        <w:numPr>
+          <w:ilvl w:val="2"/>
+          <w:numId w:val="8"/>
+        </w:numPr>
+      </w:pPr>
+      <w:r>
+        <w:rPr>
+          <w:b/>
+          <w:bCs/>
+        </w:rPr>
+        <w:t>PUT</w:t>
+      </w:r>
+      <w:r>
+        <w:t xml:space="preserve"> – Update an existing order.</w:t>
+      </w:r>
+    </w:p>
+    <w:p>
+      <w:pPr>
+        <w:numPr>
+          <w:ilvl w:val="2"/>
+          <w:numId w:val="8"/>
+        </w:numPr>
+      </w:pPr>
+      <w:r>
+        <w:rPr>
+          <w:b/>
+          <w:bCs/>
+        </w:rPr>
+        <w:t>PATCH</w:t>
+      </w:r>
+      <w:r>
+        <w:t xml:space="preserve"> – Modify only the order status.</w:t>
+      </w:r>
+    </w:p>
+    <w:p>
+      <w:pPr>
+        <w:numPr>
+          <w:ilvl w:val="2"/>
+          <w:numId w:val="8"/>
+        </w:numPr>
+      </w:pPr>
+      <w:r>
+        <w:rPr>
+          <w:b/>
+          <w:bCs/>
+        </w:rPr>
+        <w:t>DELETE</w:t>
+      </w:r>
+      <w:r>
+        <w:t xml:space="preserve"> – Delete an existing order.</w:t>
+      </w:r>
+    </w:p>
+    <w:p/>
+    <w:p>
+      <w:r>
         <w:t> </w:t>
       </w:r>
     </w:p>
     <w:p>
       <w:r>
-        <w:t>All 3 Testcases passed</w:t>
-      </w:r>
-    </w:p>
-    <w:p>
-      <w:r>
         <w:t> </w:t>
       </w:r>
     </w:p>
@@ -723,7 +1202,51 @@
           <w:b/>
           <w:bCs/>
         </w:rPr>
-        <w:t>8. Evidence</w:t>
+        <w:t>5</w:t>
+      </w:r>
+      <w:r>
+        <w:rPr>
+          <w:b/>
+          <w:bCs/>
+        </w:rPr>
+        <w:t>. Results</w:t>
+      </w:r>
+    </w:p>
+    <w:p>
+      <w:r>
+        <w:t> </w:t>
+      </w:r>
+    </w:p>
+    <w:p/>
+    <w:p/>
+    <w:p/>
+    <w:p/>
+    <w:p/>
+    <w:p>
+      <w:r>
+        <w:t> </w:t>
+      </w:r>
+    </w:p>
+    <w:p>
+      <w:pPr>
+        <w:rPr>
+          <w:b/>
+          <w:bCs/>
+        </w:rPr>
+      </w:pPr>
+      <w:r>
+        <w:rPr>
+          <w:b/>
+          <w:bCs/>
+        </w:rPr>
+        <w:t>6</w:t>
+      </w:r>
+      <w:r>
+        <w:rPr>
+          <w:b/>
+          <w:bCs/>
+        </w:rPr>
+        <w:t>. Evidence</w:t>
       </w:r>
     </w:p>
     <w:p>
@@ -747,7 +1270,7 @@
                     <pic:cNvPicPr/>
                   </pic:nvPicPr>
                   <pic:blipFill>
-                    <a:blip r:embed="rId6"/>
+                    <a:blip r:embed="rId7"/>
                     <a:stretch>
                       <a:fillRect/>
                     </a:stretch>
@@ -770,6 +1293,7 @@
     </w:p>
     <w:p>
       <w:r>
+        <w:lastRenderedPageBreak/>
         <w:drawing>
           <wp:inline distT="0" distB="0" distL="0" distR="0" wp14:anchorId="3554BAEE" wp14:editId="0CA7FF34">
             <wp:extent cx="5731510" cy="3893185"/>
@@ -786,7 +1310,7 @@
                     <pic:cNvPicPr/>
                   </pic:nvPicPr>
                   <pic:blipFill>
-                    <a:blip r:embed="rId7"/>
+                    <a:blip r:embed="rId8"/>
                     <a:stretch>
                       <a:fillRect/>
                     </a:stretch>
@@ -809,7 +1333,6 @@
     </w:p>
     <w:p>
       <w:r>
-        <w:lastRenderedPageBreak/>
         <w:drawing>
           <wp:inline distT="0" distB="0" distL="0" distR="0" wp14:anchorId="4D290A82" wp14:editId="028BA141">
             <wp:extent cx="5731510" cy="4653280"/>
@@ -826,7 +1349,7 @@
                     <pic:cNvPicPr/>
                   </pic:nvPicPr>
                   <pic:blipFill>
-                    <a:blip r:embed="rId8"/>
+                    <a:blip r:embed="rId9"/>
                     <a:stretch>
                       <a:fillRect/>
                     </a:stretch>
@@ -866,7 +1389,7 @@
                     <pic:cNvPicPr/>
                   </pic:nvPicPr>
                   <pic:blipFill>
-                    <a:blip r:embed="rId9"/>
+                    <a:blip r:embed="rId10"/>
                     <a:stretch>
                       <a:fillRect/>
                     </a:stretch>
@@ -905,7 +1428,7 @@
                     <pic:cNvPicPr/>
                   </pic:nvPicPr>
                   <pic:blipFill>
-                    <a:blip r:embed="rId10"/>
+                    <a:blip r:embed="rId11"/>
                     <a:stretch>
                       <a:fillRect/>
                     </a:stretch>
@@ -945,7 +1468,7 @@
                     <pic:cNvPicPr/>
                   </pic:nvPicPr>
                   <pic:blipFill>
-                    <a:blip r:embed="rId11"/>
+                    <a:blip r:embed="rId12"/>
                     <a:stretch>
                       <a:fillRect/>
                     </a:stretch>
@@ -985,7 +1508,7 @@
                     <pic:cNvPicPr/>
                   </pic:nvPicPr>
                   <pic:blipFill>
-                    <a:blip r:embed="rId12"/>
+                    <a:blip r:embed="rId13"/>
                     <a:stretch>
                       <a:fillRect/>
                     </a:stretch>
@@ -1024,7 +1547,7 @@
                     <pic:cNvPicPr/>
                   </pic:nvPicPr>
                   <pic:blipFill>
-                    <a:blip r:embed="rId13"/>
+                    <a:blip r:embed="rId14"/>
                     <a:stretch>
                       <a:fillRect/>
                     </a:stretch>
@@ -1064,7 +1587,7 @@
                     <pic:cNvPicPr/>
                   </pic:nvPicPr>
                   <pic:blipFill>
-                    <a:blip r:embed="rId14"/>
+                    <a:blip r:embed="rId15"/>
                     <a:stretch>
                       <a:fillRect/>
                     </a:stretch>
@@ -1104,7 +1627,7 @@
                     <pic:cNvPicPr/>
                   </pic:nvPicPr>
                   <pic:blipFill>
-                    <a:blip r:embed="rId15"/>
+                    <a:blip r:embed="rId16"/>
                     <a:stretch>
                       <a:fillRect/>
                     </a:stretch>
@@ -1150,7 +1673,7 @@
                     <pic:cNvPicPr/>
                   </pic:nvPicPr>
                   <pic:blipFill>
-                    <a:blip r:embed="rId16"/>
+                    <a:blip r:embed="rId17"/>
                     <a:stretch>
                       <a:fillRect/>
                     </a:stretch>
@@ -1190,7 +1713,7 @@
                     <pic:cNvPicPr/>
                   </pic:nvPicPr>
                   <pic:blipFill>
-                    <a:blip r:embed="rId17"/>
+                    <a:blip r:embed="rId18"/>
                     <a:stretch>
                       <a:fillRect/>
                     </a:stretch>
@@ -1236,7 +1759,7 @@
                     <pic:cNvPicPr/>
                   </pic:nvPicPr>
                   <pic:blipFill>
-                    <a:blip r:embed="rId18"/>
+                    <a:blip r:embed="rId19"/>
                     <a:stretch>
                       <a:fillRect/>
                     </a:stretch>
@@ -1276,7 +1799,7 @@
                     <pic:cNvPicPr/>
                   </pic:nvPicPr>
                   <pic:blipFill>
-                    <a:blip r:embed="rId19"/>
+                    <a:blip r:embed="rId20"/>
                     <a:stretch>
                       <a:fillRect/>
                     </a:stretch>
@@ -1316,7 +1839,7 @@
                     <pic:cNvPicPr/>
                   </pic:nvPicPr>
                   <pic:blipFill>
-                    <a:blip r:embed="rId20"/>
+                    <a:blip r:embed="rId21"/>
                     <a:stretch>
                       <a:fillRect/>
                     </a:stretch>
@@ -1356,7 +1879,7 @@
                     <pic:cNvPicPr/>
                   </pic:nvPicPr>
                   <pic:blipFill>
-                    <a:blip r:embed="rId21"/>
+                    <a:blip r:embed="rId22"/>
                     <a:stretch>
                       <a:fillRect/>
                     </a:stretch>
@@ -1395,7 +1918,7 @@
                     <pic:cNvPicPr/>
                   </pic:nvPicPr>
                   <pic:blipFill>
-                    <a:blip r:embed="rId22"/>
+                    <a:blip r:embed="rId23"/>
                     <a:stretch>
                       <a:fillRect/>
                     </a:stretch>
@@ -1440,7 +1963,7 @@
                     <pic:cNvPicPr/>
                   </pic:nvPicPr>
                   <pic:blipFill>
-                    <a:blip r:embed="rId23"/>
+                    <a:blip r:embed="rId24"/>
                     <a:stretch>
                       <a:fillRect/>
                     </a:stretch>
@@ -1479,7 +2002,7 @@
                     <pic:cNvPicPr/>
                   </pic:nvPicPr>
                   <pic:blipFill>
-                    <a:blip r:embed="rId24"/>
+                    <a:blip r:embed="rId25"/>
                     <a:stretch>
                       <a:fillRect/>
                     </a:stretch>
@@ -1519,7 +2042,7 @@
                     <pic:cNvPicPr/>
                   </pic:nvPicPr>
                   <pic:blipFill>
-                    <a:blip r:embed="rId25"/>
+                    <a:blip r:embed="rId26"/>
                     <a:stretch>
                       <a:fillRect/>
                     </a:stretch>
@@ -1558,7 +2081,7 @@
                     <pic:cNvPicPr/>
                   </pic:nvPicPr>
                   <pic:blipFill>
-                    <a:blip r:embed="rId26"/>
+                    <a:blip r:embed="rId27"/>
                     <a:stretch>
                       <a:fillRect/>
                     </a:stretch>
@@ -1597,7 +2120,7 @@
                     <pic:cNvPicPr/>
                   </pic:nvPicPr>
                   <pic:blipFill>
-                    <a:blip r:embed="rId27"/>
+                    <a:blip r:embed="rId28"/>
                     <a:stretch>
                       <a:fillRect/>
                     </a:stretch>
@@ -1637,7 +2160,7 @@
                     <pic:cNvPicPr/>
                   </pic:nvPicPr>
                   <pic:blipFill>
-                    <a:blip r:embed="rId28"/>
+                    <a:blip r:embed="rId29"/>
                     <a:stretch>
                       <a:fillRect/>
                     </a:stretch>
@@ -1676,7 +2199,7 @@
                     <pic:cNvPicPr/>
                   </pic:nvPicPr>
                   <pic:blipFill>
-                    <a:blip r:embed="rId29"/>
+                    <a:blip r:embed="rId30"/>
                     <a:stretch>
                       <a:fillRect/>
                     </a:stretch>
@@ -1722,7 +2245,7 @@
                     <pic:cNvPicPr/>
                   </pic:nvPicPr>
                   <pic:blipFill>
-                    <a:blip r:embed="rId30"/>
+                    <a:blip r:embed="rId31"/>
                     <a:stretch>
                       <a:fillRect/>
                     </a:stretch>
@@ -1767,7 +2290,7 @@
                     <pic:cNvPicPr/>
                   </pic:nvPicPr>
                   <pic:blipFill>
-                    <a:blip r:embed="rId31"/>
+                    <a:blip r:embed="rId32"/>
                     <a:stretch>
                       <a:fillRect/>
                     </a:stretch>
@@ -1812,7 +2335,7 @@
                     <pic:cNvPicPr/>
                   </pic:nvPicPr>
                   <pic:blipFill>
-                    <a:blip r:embed="rId32"/>
+                    <a:blip r:embed="rId33"/>
                     <a:stretch>
                       <a:fillRect/>
                     </a:stretch>
@@ -1845,7 +2368,14 @@
           <w:b/>
           <w:bCs/>
         </w:rPr>
-        <w:t>9. Environment details</w:t>
+        <w:t>7</w:t>
+      </w:r>
+      <w:r>
+        <w:rPr>
+          <w:b/>
+          <w:bCs/>
+        </w:rPr>
+        <w:t>. Environment details</w:t>
       </w:r>
     </w:p>
     <w:p>
@@ -1877,7 +2407,7 @@
                     <pic:cNvPicPr/>
                   </pic:nvPicPr>
                   <pic:blipFill>
-                    <a:blip r:embed="rId33"/>
+                    <a:blip r:embed="rId34"/>
                     <a:stretch>
                       <a:fillRect/>
                     </a:stretch>
@@ -1920,7 +2450,14 @@
           <w:b/>
           <w:bCs/>
         </w:rPr>
-        <w:t>11. Conclusion —</w:t>
+        <w:t>8</w:t>
+      </w:r>
+      <w:r>
+        <w:rPr>
+          <w:b/>
+          <w:bCs/>
+        </w:rPr>
+        <w:t>. Conclusion —</w:t>
       </w:r>
     </w:p>
     <w:p>
@@ -2274,6 +2811,127 @@
     </w:lvl>
   </w:abstractNum>
   <w:abstractNum w:abstractNumId="2" w15:restartNumberingAfterBreak="0">
+    <w:nsid w:val="28BF70F1"/>
+    <w:multiLevelType w:val="multilevel"/>
+    <w:tmpl w:val="3C26F5B4"/>
+    <w:lvl w:ilvl="0">
+      <w:start w:val="1"/>
+      <w:numFmt w:val="decimal"/>
+      <w:lvlText w:val="%1."/>
+      <w:lvlJc w:val="left"/>
+      <w:pPr>
+        <w:tabs>
+          <w:tab w:val="num" w:pos="720"/>
+        </w:tabs>
+        <w:ind w:left="720" w:hanging="360"/>
+      </w:pPr>
+    </w:lvl>
+    <w:lvl w:ilvl="1">
+      <w:start w:val="1"/>
+      <w:numFmt w:val="bullet"/>
+      <w:lvlText w:val="o"/>
+      <w:lvlJc w:val="left"/>
+      <w:pPr>
+        <w:tabs>
+          <w:tab w:val="num" w:pos="1440"/>
+        </w:tabs>
+        <w:ind w:left="1440" w:hanging="360"/>
+      </w:pPr>
+      <w:rPr>
+        <w:rFonts w:ascii="Courier New" w:hAnsi="Courier New" w:hint="default"/>
+        <w:sz w:val="20"/>
+      </w:rPr>
+    </w:lvl>
+    <w:lvl w:ilvl="2">
+      <w:start w:val="1"/>
+      <w:numFmt w:val="bullet"/>
+      <w:lvlText w:val=""/>
+      <w:lvlJc w:val="left"/>
+      <w:pPr>
+        <w:tabs>
+          <w:tab w:val="num" w:pos="2160"/>
+        </w:tabs>
+        <w:ind w:left="2160" w:hanging="360"/>
+      </w:pPr>
+      <w:rPr>
+        <w:rFonts w:ascii="Wingdings" w:hAnsi="Wingdings" w:hint="default"/>
+        <w:sz w:val="20"/>
+      </w:rPr>
+    </w:lvl>
+    <w:lvl w:ilvl="3" w:tentative="1">
+      <w:start w:val="1"/>
+      <w:numFmt w:val="decimal"/>
+      <w:lvlText w:val="%4."/>
+      <w:lvlJc w:val="left"/>
+      <w:pPr>
+        <w:tabs>
+          <w:tab w:val="num" w:pos="2880"/>
+        </w:tabs>
+        <w:ind w:left="2880" w:hanging="360"/>
+      </w:pPr>
+    </w:lvl>
+    <w:lvl w:ilvl="4" w:tentative="1">
+      <w:start w:val="1"/>
+      <w:numFmt w:val="decimal"/>
+      <w:lvlText w:val="%5."/>
+      <w:lvlJc w:val="left"/>
+      <w:pPr>
+        <w:tabs>
+          <w:tab w:val="num" w:pos="3600"/>
+        </w:tabs>
+        <w:ind w:left="3600" w:hanging="360"/>
+      </w:pPr>
+    </w:lvl>
+    <w:lvl w:ilvl="5" w:tentative="1">
+      <w:start w:val="1"/>
+      <w:numFmt w:val="decimal"/>
+      <w:lvlText w:val="%6."/>
+      <w:lvlJc w:val="left"/>
+      <w:pPr>
+        <w:tabs>
+          <w:tab w:val="num" w:pos="4320"/>
+        </w:tabs>
+        <w:ind w:left="4320" w:hanging="360"/>
+      </w:pPr>
+    </w:lvl>
+    <w:lvl w:ilvl="6" w:tentative="1">
+      <w:start w:val="1"/>
+      <w:numFmt w:val="decimal"/>
+      <w:lvlText w:val="%7."/>
+      <w:lvlJc w:val="left"/>
+      <w:pPr>
+        <w:tabs>
+          <w:tab w:val="num" w:pos="5040"/>
+        </w:tabs>
+        <w:ind w:left="5040" w:hanging="360"/>
+      </w:pPr>
+    </w:lvl>
+    <w:lvl w:ilvl="7" w:tentative="1">
+      <w:start w:val="1"/>
+      <w:numFmt w:val="decimal"/>
+      <w:lvlText w:val="%8."/>
+      <w:lvlJc w:val="left"/>
+      <w:pPr>
+        <w:tabs>
+          <w:tab w:val="num" w:pos="5760"/>
+        </w:tabs>
+        <w:ind w:left="5760" w:hanging="360"/>
+      </w:pPr>
+    </w:lvl>
+    <w:lvl w:ilvl="8" w:tentative="1">
+      <w:start w:val="1"/>
+      <w:numFmt w:val="decimal"/>
+      <w:lvlText w:val="%9."/>
+      <w:lvlJc w:val="left"/>
+      <w:pPr>
+        <w:tabs>
+          <w:tab w:val="num" w:pos="6480"/>
+        </w:tabs>
+        <w:ind w:left="6480" w:hanging="360"/>
+      </w:pPr>
+    </w:lvl>
+  </w:abstractNum>
+  <w:abstractNum w:abstractNumId="3" w15:restartNumberingAfterBreak="0">
     <w:nsid w:val="2F022AA7"/>
     <w:multiLevelType w:val="multilevel"/>
     <w:tmpl w:val="2968F2E2"/>
@@ -2422,7 +3080,124 @@
       </w:rPr>
     </w:lvl>
   </w:abstractNum>
-  <w:abstractNum w:abstractNumId="3" w15:restartNumberingAfterBreak="0">
+  <w:abstractNum w:abstractNumId="4" w15:restartNumberingAfterBreak="0">
+    <w:nsid w:val="2FAF141B"/>
+    <w:multiLevelType w:val="multilevel"/>
+    <w:tmpl w:val="142AF580"/>
+    <w:lvl w:ilvl="0">
+      <w:start w:val="1"/>
+      <w:numFmt w:val="decimal"/>
+      <w:lvlText w:val="%1."/>
+      <w:lvlJc w:val="left"/>
+      <w:pPr>
+        <w:tabs>
+          <w:tab w:val="num" w:pos="720"/>
+        </w:tabs>
+        <w:ind w:left="720" w:hanging="360"/>
+      </w:pPr>
+    </w:lvl>
+    <w:lvl w:ilvl="1">
+      <w:start w:val="1"/>
+      <w:numFmt w:val="bullet"/>
+      <w:lvlText w:val="o"/>
+      <w:lvlJc w:val="left"/>
+      <w:pPr>
+        <w:tabs>
+          <w:tab w:val="num" w:pos="1440"/>
+        </w:tabs>
+        <w:ind w:left="1440" w:hanging="360"/>
+      </w:pPr>
+      <w:rPr>
+        <w:rFonts w:ascii="Courier New" w:hAnsi="Courier New" w:hint="default"/>
+        <w:sz w:val="20"/>
+      </w:rPr>
+    </w:lvl>
+    <w:lvl w:ilvl="2" w:tentative="1">
+      <w:start w:val="1"/>
+      <w:numFmt w:val="decimal"/>
+      <w:lvlText w:val="%3."/>
+      <w:lvlJc w:val="left"/>
+      <w:pPr>
+        <w:tabs>
+          <w:tab w:val="num" w:pos="2160"/>
+        </w:tabs>
+        <w:ind w:left="2160" w:hanging="360"/>
+      </w:pPr>
+    </w:lvl>
+    <w:lvl w:ilvl="3" w:tentative="1">
+      <w:start w:val="1"/>
+      <w:numFmt w:val="decimal"/>
+      <w:lvlText w:val="%4."/>
+      <w:lvlJc w:val="left"/>
+      <w:pPr>
+        <w:tabs>
+          <w:tab w:val="num" w:pos="2880"/>
+        </w:tabs>
+        <w:ind w:left="2880" w:hanging="360"/>
+      </w:pPr>
+    </w:lvl>
+    <w:lvl w:ilvl="4" w:tentative="1">
+      <w:start w:val="1"/>
+      <w:numFmt w:val="decimal"/>
+      <w:lvlText w:val="%5."/>
+      <w:lvlJc w:val="left"/>
+      <w:pPr>
+        <w:tabs>
+          <w:tab w:val="num" w:pos="3600"/>
+        </w:tabs>
+        <w:ind w:left="3600" w:hanging="360"/>
+      </w:pPr>
+    </w:lvl>
+    <w:lvl w:ilvl="5" w:tentative="1">
+      <w:start w:val="1"/>
+      <w:numFmt w:val="decimal"/>
+      <w:lvlText w:val="%6."/>
+      <w:lvlJc w:val="left"/>
+      <w:pPr>
+        <w:tabs>
+          <w:tab w:val="num" w:pos="4320"/>
+        </w:tabs>
+        <w:ind w:left="4320" w:hanging="360"/>
+      </w:pPr>
+    </w:lvl>
+    <w:lvl w:ilvl="6" w:tentative="1">
+      <w:start w:val="1"/>
+      <w:numFmt w:val="decimal"/>
+      <w:lvlText w:val="%7."/>
+      <w:lvlJc w:val="left"/>
+      <w:pPr>
+        <w:tabs>
+          <w:tab w:val="num" w:pos="5040"/>
+        </w:tabs>
+        <w:ind w:left="5040" w:hanging="360"/>
+      </w:pPr>
+    </w:lvl>
+    <w:lvl w:ilvl="7" w:tentative="1">
+      <w:start w:val="1"/>
+      <w:numFmt w:val="decimal"/>
+      <w:lvlText w:val="%8."/>
+      <w:lvlJc w:val="left"/>
+      <w:pPr>
+        <w:tabs>
+          <w:tab w:val="num" w:pos="5760"/>
+        </w:tabs>
+        <w:ind w:left="5760" w:hanging="360"/>
+      </w:pPr>
+    </w:lvl>
+    <w:lvl w:ilvl="8" w:tentative="1">
+      <w:start w:val="1"/>
+      <w:numFmt w:val="decimal"/>
+      <w:lvlText w:val="%9."/>
+      <w:lvlJc w:val="left"/>
+      <w:pPr>
+        <w:tabs>
+          <w:tab w:val="num" w:pos="6480"/>
+        </w:tabs>
+        <w:ind w:left="6480" w:hanging="360"/>
+      </w:pPr>
+    </w:lvl>
+  </w:abstractNum>
+  <w:abstractNum w:abstractNumId="5" w15:restartNumberingAfterBreak="0">
     <w:nsid w:val="4DC24806"/>
     <w:multiLevelType w:val="multilevel"/>
     <w:tmpl w:val="965AA7C2"/>
@@ -2571,7 +3346,7 @@
       </w:rPr>
     </w:lvl>
   </w:abstractNum>
-  <w:abstractNum w:abstractNumId="4" w15:restartNumberingAfterBreak="0">
+  <w:abstractNum w:abstractNumId="6" w15:restartNumberingAfterBreak="0">
     <w:nsid w:val="612B0107"/>
     <w:multiLevelType w:val="multilevel"/>
     <w:tmpl w:val="0AB084B6"/>
@@ -2684,7 +3459,7 @@
       </w:pPr>
     </w:lvl>
   </w:abstractNum>
-  <w:abstractNum w:abstractNumId="5" w15:restartNumberingAfterBreak="0">
+  <w:abstractNum w:abstractNumId="7" w15:restartNumberingAfterBreak="0">
     <w:nsid w:val="62F64395"/>
     <w:multiLevelType w:val="multilevel"/>
     <w:tmpl w:val="C25A8E50"/>
@@ -2834,22 +3609,28 @@
     </w:lvl>
   </w:abstractNum>
   <w:num w:numId="1" w16cid:durableId="642540862">
-    <w:abstractNumId w:val="2"/>
+    <w:abstractNumId w:val="3"/>
   </w:num>
   <w:num w:numId="2" w16cid:durableId="563414957">
-    <w:abstractNumId w:val="3"/>
+    <w:abstractNumId w:val="5"/>
   </w:num>
   <w:num w:numId="3" w16cid:durableId="519512461">
     <w:abstractNumId w:val="1"/>
   </w:num>
   <w:num w:numId="4" w16cid:durableId="145316582">
-    <w:abstractNumId w:val="5"/>
+    <w:abstractNumId w:val="7"/>
   </w:num>
   <w:num w:numId="5" w16cid:durableId="1341617390">
-    <w:abstractNumId w:val="4"/>
+    <w:abstractNumId w:val="6"/>
   </w:num>
   <w:num w:numId="6" w16cid:durableId="393236353">
     <w:abstractNumId w:val="0"/>
+  </w:num>
+  <w:num w:numId="7" w16cid:durableId="1591888917">
+    <w:abstractNumId w:val="4"/>
+  </w:num>
+  <w:num w:numId="8" w16cid:durableId="1522014963">
+    <w:abstractNumId w:val="2"/>
   </w:num>
 </w:numbering>
 </file>

</xml_diff>

<commit_message>
week 4 gate 4  _6
</commit_message>
<xml_diff>
--- a/Demo_Report.docx
+++ b/Demo_Report.docx
@@ -454,6 +454,23 @@
     </w:p>
     <w:p>
       <w:r>
+        <w:t>To run the Selenide</w:t>
+      </w:r>
+    </w:p>
+    <w:p>
+      <w:pPr>
+        <w:pStyle w:val="ListParagraph"/>
+        <w:numPr>
+          <w:ilvl w:val="0"/>
+          <w:numId w:val="9"/>
+        </w:numPr>
+      </w:pPr>
+      <w:r>
+        <w:t>mvn test</w:t>
+      </w:r>
+    </w:p>
+    <w:p>
+      <w:r>
         <w:br/>
       </w:r>
       <w:r>
@@ -3608,6 +3625,119 @@
       </w:rPr>
     </w:lvl>
   </w:abstractNum>
+  <w:abstractNum w:abstractNumId="8" w15:restartNumberingAfterBreak="0">
+    <w:nsid w:val="753B283F"/>
+    <w:multiLevelType w:val="hybridMultilevel"/>
+    <w:tmpl w:val="5F829B58"/>
+    <w:lvl w:ilvl="0" w:tplc="40090001">
+      <w:start w:val="1"/>
+      <w:numFmt w:val="bullet"/>
+      <w:lvlText w:val=""/>
+      <w:lvlJc w:val="left"/>
+      <w:pPr>
+        <w:ind w:left="720" w:hanging="360"/>
+      </w:pPr>
+      <w:rPr>
+        <w:rFonts w:ascii="Symbol" w:hAnsi="Symbol" w:hint="default"/>
+      </w:rPr>
+    </w:lvl>
+    <w:lvl w:ilvl="1" w:tplc="40090003" w:tentative="1">
+      <w:start w:val="1"/>
+      <w:numFmt w:val="bullet"/>
+      <w:lvlText w:val="o"/>
+      <w:lvlJc w:val="left"/>
+      <w:pPr>
+        <w:ind w:left="1440" w:hanging="360"/>
+      </w:pPr>
+      <w:rPr>
+        <w:rFonts w:ascii="Courier New" w:hAnsi="Courier New" w:cs="Courier New" w:hint="default"/>
+      </w:rPr>
+    </w:lvl>
+    <w:lvl w:ilvl="2" w:tplc="40090005" w:tentative="1">
+      <w:start w:val="1"/>
+      <w:numFmt w:val="bullet"/>
+      <w:lvlText w:val=""/>
+      <w:lvlJc w:val="left"/>
+      <w:pPr>
+        <w:ind w:left="2160" w:hanging="360"/>
+      </w:pPr>
+      <w:rPr>
+        <w:rFonts w:ascii="Wingdings" w:hAnsi="Wingdings" w:hint="default"/>
+      </w:rPr>
+    </w:lvl>
+    <w:lvl w:ilvl="3" w:tplc="40090001" w:tentative="1">
+      <w:start w:val="1"/>
+      <w:numFmt w:val="bullet"/>
+      <w:lvlText w:val=""/>
+      <w:lvlJc w:val="left"/>
+      <w:pPr>
+        <w:ind w:left="2880" w:hanging="360"/>
+      </w:pPr>
+      <w:rPr>
+        <w:rFonts w:ascii="Symbol" w:hAnsi="Symbol" w:hint="default"/>
+      </w:rPr>
+    </w:lvl>
+    <w:lvl w:ilvl="4" w:tplc="40090003" w:tentative="1">
+      <w:start w:val="1"/>
+      <w:numFmt w:val="bullet"/>
+      <w:lvlText w:val="o"/>
+      <w:lvlJc w:val="left"/>
+      <w:pPr>
+        <w:ind w:left="3600" w:hanging="360"/>
+      </w:pPr>
+      <w:rPr>
+        <w:rFonts w:ascii="Courier New" w:hAnsi="Courier New" w:cs="Courier New" w:hint="default"/>
+      </w:rPr>
+    </w:lvl>
+    <w:lvl w:ilvl="5" w:tplc="40090005" w:tentative="1">
+      <w:start w:val="1"/>
+      <w:numFmt w:val="bullet"/>
+      <w:lvlText w:val=""/>
+      <w:lvlJc w:val="left"/>
+      <w:pPr>
+        <w:ind w:left="4320" w:hanging="360"/>
+      </w:pPr>
+      <w:rPr>
+        <w:rFonts w:ascii="Wingdings" w:hAnsi="Wingdings" w:hint="default"/>
+      </w:rPr>
+    </w:lvl>
+    <w:lvl w:ilvl="6" w:tplc="40090001" w:tentative="1">
+      <w:start w:val="1"/>
+      <w:numFmt w:val="bullet"/>
+      <w:lvlText w:val=""/>
+      <w:lvlJc w:val="left"/>
+      <w:pPr>
+        <w:ind w:left="5040" w:hanging="360"/>
+      </w:pPr>
+      <w:rPr>
+        <w:rFonts w:ascii="Symbol" w:hAnsi="Symbol" w:hint="default"/>
+      </w:rPr>
+    </w:lvl>
+    <w:lvl w:ilvl="7" w:tplc="40090003" w:tentative="1">
+      <w:start w:val="1"/>
+      <w:numFmt w:val="bullet"/>
+      <w:lvlText w:val="o"/>
+      <w:lvlJc w:val="left"/>
+      <w:pPr>
+        <w:ind w:left="5760" w:hanging="360"/>
+      </w:pPr>
+      <w:rPr>
+        <w:rFonts w:ascii="Courier New" w:hAnsi="Courier New" w:cs="Courier New" w:hint="default"/>
+      </w:rPr>
+    </w:lvl>
+    <w:lvl w:ilvl="8" w:tplc="40090005" w:tentative="1">
+      <w:start w:val="1"/>
+      <w:numFmt w:val="bullet"/>
+      <w:lvlText w:val=""/>
+      <w:lvlJc w:val="left"/>
+      <w:pPr>
+        <w:ind w:left="6480" w:hanging="360"/>
+      </w:pPr>
+      <w:rPr>
+        <w:rFonts w:ascii="Wingdings" w:hAnsi="Wingdings" w:hint="default"/>
+      </w:rPr>
+    </w:lvl>
+  </w:abstractNum>
   <w:num w:numId="1" w16cid:durableId="642540862">
     <w:abstractNumId w:val="3"/>
   </w:num>
@@ -3631,6 +3761,9 @@
   </w:num>
   <w:num w:numId="8" w16cid:durableId="1522014963">
     <w:abstractNumId w:val="2"/>
+  </w:num>
+  <w:num w:numId="9" w16cid:durableId="1708679884">
+    <w:abstractNumId w:val="8"/>
   </w:num>
 </w:numbering>
 </file>

</xml_diff>